<commit_message>
AB aufgepeppt: IMP-Bezug, Decoder, Differenzierung, Layout-Feinschliff
- Aufgabe 4 NEU: AGB-Decoder (Matching Fachbegriff <-> Klartext, Lizenz 4.9)
- Profi-Aufgabe NEU: Coins-Rechnen mit 50-%-Split (Differenzierung + Mathebezug)
- Selbstcheck-Box am Ende (Selbsteinschaetzung)
- A2/A3 aktiviert (eigene Worte / Think-Pair-Share)
- Umlaute durchgaengig korrigiert (vorher transliteriert: Schaetzen etc.)
- Layout: Schreiblinien Zeilenabstand 2.0, Tabellenzellen 3 Zeilen,
  Bloecke zusammengehalten, Raender 1.2 cm, Seitenzahl "Seite X von Y"

Co-Authored-By: Claude Opus 4.8 (1M context) <noreply@anthropic.com>
</commit_message>
<xml_diff>
--- a/Arbeitsblatt_TikTok_AGB.docx
+++ b/Arbeitsblatt_TikTok_AGB.docx
@@ -27,7 +27,7 @@
           <w:color w:val="666666"/>
           <w:sz w:val="22"/>
         </w:rPr>
-        <w:t>TikTok-AGB - Begleitheft zur Praesentation</w:t>
+        <w:t>TikTok-AGB - Begleitheft zur Präsentation</w:t>
       </w:r>
     </w:p>
     <w:tbl>
@@ -93,6 +93,7 @@
     </w:p>
     <w:p>
       <w:pPr>
+        <w:keepNext/>
         <w:spacing w:before="280" w:after="80"/>
       </w:pPr>
       <w:r>
@@ -111,7 +112,7 @@
           <w:color w:val="1A1A1A"/>
           <w:sz w:val="24"/>
         </w:rPr>
-        <w:t>Schaetzen - bevor die Praesentation startet</w:t>
+        <w:t>Schätzen - bevor die Präsentation startet</w:t>
       </w:r>
     </w:p>
     <w:p>
@@ -126,7 +127,7 @@
           <w:color w:val="666666"/>
           <w:sz w:val="22"/>
         </w:rPr>
-        <w:t>Wie schaetzt du es ein? Kreuze an oder schreibe deine Vermutung. Wir loesen es danach gemeinsam auf.</w:t>
+        <w:t>Wie schätzt du es ein? Kreuze an oder schreibe deine Vermutung. Wir lösen es danach gemeinsam auf.</w:t>
       </w:r>
     </w:p>
     <w:p>
@@ -178,7 +179,7 @@
           <w:color w:val="666666"/>
           <w:sz w:val="22"/>
         </w:rPr>
-        <w:t>[ ] fast alles   [ ] etwa die Haelfte   [ ] nur ein Viertel</w:t>
+        <w:t>[ ] fast alles   [ ] etwa die Hälfte   [ ] nur ein Viertel</w:t>
       </w:r>
     </w:p>
     <w:p>
@@ -191,7 +192,7 @@
           <w:color w:val="1A1A1A"/>
           <w:sz w:val="22"/>
         </w:rPr>
-        <w:t xml:space="preserve">  &gt;  Was sammelt TikTok automatisch ueber dich? (Mehrfachnennung moeglich)</w:t>
+        <w:t xml:space="preserve">  &gt;  Was sammelt TikTok automatisch über dich? (Mehrfachnennung möglich)</w:t>
       </w:r>
     </w:p>
     <w:p>
@@ -261,6 +262,7 @@
     </w:p>
     <w:p>
       <w:pPr>
+        <w:keepNext/>
         <w:spacing w:before="280" w:after="80"/>
       </w:pPr>
       <w:r>
@@ -279,7 +281,7 @@
           <w:color w:val="1A1A1A"/>
           <w:sz w:val="24"/>
         </w:rPr>
-        <w:t>Mitschreiben waehrend der Praesentation</w:t>
+        <w:t>Mitdenken während der Präsentation</w:t>
       </w:r>
     </w:p>
     <w:p>
@@ -294,11 +296,12 @@
           <w:color w:val="666666"/>
           <w:sz w:val="22"/>
         </w:rPr>
-        <w:t>Notiere pro Bereich mindestens 2 Aha-Momente, die dich am meisten ueberraschen.</w:t>
+        <w:t>Schreibe pro Bereich in EIGENEN Worten mindestens 2 Dinge auf, die dich überraschen - nicht abschreiben, sondern so, dass deine Banknachbarin / dein Banknachbar es versteht.</w:t>
       </w:r>
     </w:p>
     <w:p>
       <w:pPr>
+        <w:keepNext/>
         <w:spacing w:after="80" w:before="120"/>
       </w:pPr>
       <w:r>
@@ -314,7 +317,8 @@
     </w:p>
     <w:p>
       <w:pPr>
-        <w:spacing w:after="0" w:before="0"/>
+        <w:keepNext/>
+        <w:spacing w:after="0" w:before="0" w:line="480" w:lineRule="auto"/>
       </w:pPr>
       <w:r>
         <w:rPr>
@@ -326,7 +330,7 @@
     </w:p>
     <w:p>
       <w:pPr>
-        <w:spacing w:after="0" w:before="0"/>
+        <w:spacing w:after="0" w:before="0" w:line="480" w:lineRule="auto"/>
       </w:pPr>
       <w:r>
         <w:rPr>
@@ -338,18 +342,7 @@
     </w:p>
     <w:p>
       <w:pPr>
-        <w:spacing w:after="0" w:before="0"/>
-      </w:pPr>
-      <w:r>
-        <w:rPr>
-          <w:color w:val="CCCCCC"/>
-          <w:sz w:val="22"/>
-        </w:rPr>
-        <w:t>__________________________________________________________________________________________</w:t>
-      </w:r>
-    </w:p>
-    <w:p>
-      <w:pPr>
+        <w:keepNext/>
         <w:spacing w:after="80" w:before="120"/>
       </w:pPr>
       <w:r>
@@ -365,7 +358,8 @@
     </w:p>
     <w:p>
       <w:pPr>
-        <w:spacing w:after="0" w:before="0"/>
+        <w:keepNext/>
+        <w:spacing w:after="0" w:before="0" w:line="480" w:lineRule="auto"/>
       </w:pPr>
       <w:r>
         <w:rPr>
@@ -377,7 +371,7 @@
     </w:p>
     <w:p>
       <w:pPr>
-        <w:spacing w:after="0" w:before="0"/>
+        <w:spacing w:after="0" w:before="0" w:line="480" w:lineRule="auto"/>
       </w:pPr>
       <w:r>
         <w:rPr>
@@ -389,18 +383,7 @@
     </w:p>
     <w:p>
       <w:pPr>
-        <w:spacing w:after="0" w:before="0"/>
-      </w:pPr>
-      <w:r>
-        <w:rPr>
-          <w:color w:val="CCCCCC"/>
-          <w:sz w:val="22"/>
-        </w:rPr>
-        <w:t>__________________________________________________________________________________________</w:t>
-      </w:r>
-    </w:p>
-    <w:p>
-      <w:pPr>
+        <w:keepNext/>
         <w:spacing w:after="80" w:before="120"/>
       </w:pPr>
       <w:r>
@@ -416,7 +399,8 @@
     </w:p>
     <w:p>
       <w:pPr>
-        <w:spacing w:after="0" w:before="0"/>
+        <w:keepNext/>
+        <w:spacing w:after="0" w:before="0" w:line="480" w:lineRule="auto"/>
       </w:pPr>
       <w:r>
         <w:rPr>
@@ -428,7 +412,7 @@
     </w:p>
     <w:p>
       <w:pPr>
-        <w:spacing w:after="0" w:before="0"/>
+        <w:spacing w:after="0" w:before="0" w:line="480" w:lineRule="auto"/>
       </w:pPr>
       <w:r>
         <w:rPr>
@@ -440,18 +424,7 @@
     </w:p>
     <w:p>
       <w:pPr>
-        <w:spacing w:after="0" w:before="0"/>
-      </w:pPr>
-      <w:r>
-        <w:rPr>
-          <w:color w:val="CCCCCC"/>
-          <w:sz w:val="22"/>
-        </w:rPr>
-        <w:t>__________________________________________________________________________________________</w:t>
-      </w:r>
-    </w:p>
-    <w:p>
-      <w:pPr>
+        <w:keepNext/>
         <w:spacing w:after="80" w:before="120"/>
       </w:pPr>
       <w:r>
@@ -467,7 +440,8 @@
     </w:p>
     <w:p>
       <w:pPr>
-        <w:spacing w:after="0" w:before="0"/>
+        <w:keepNext/>
+        <w:spacing w:after="0" w:before="0" w:line="480" w:lineRule="auto"/>
       </w:pPr>
       <w:r>
         <w:rPr>
@@ -479,7 +453,7 @@
     </w:p>
     <w:p>
       <w:pPr>
-        <w:spacing w:after="0" w:before="0"/>
+        <w:spacing w:after="0" w:before="0" w:line="480" w:lineRule="auto"/>
       </w:pPr>
       <w:r>
         <w:rPr>
@@ -491,18 +465,7 @@
     </w:p>
     <w:p>
       <w:pPr>
-        <w:spacing w:after="0" w:before="0"/>
-      </w:pPr>
-      <w:r>
-        <w:rPr>
-          <w:color w:val="CCCCCC"/>
-          <w:sz w:val="22"/>
-        </w:rPr>
-        <w:t>__________________________________________________________________________________________</w:t>
-      </w:r>
-    </w:p>
-    <w:p>
-      <w:pPr>
+        <w:keepNext/>
         <w:spacing w:before="280" w:after="80"/>
       </w:pPr>
       <w:r>
@@ -521,7 +484,7 @@
           <w:color w:val="1A1A1A"/>
           <w:sz w:val="24"/>
         </w:rPr>
-        <w:t>Mythos vs. AGB-Realitaet</w:t>
+        <w:t>Mythos vs. AGB-Realität  (Partnerarbeit)</w:t>
       </w:r>
     </w:p>
     <w:p>
@@ -536,7 +499,7 @@
           <w:color w:val="666666"/>
           <w:sz w:val="22"/>
         </w:rPr>
-        <w:t>Links steht, was viele glauben. Schreibe rechts, was wirklich in den AGB / in der Realitaet gilt.</w:t>
+        <w:t>Think-Pair-Share: Fülle die rechte Spalte zuerst ALLEIN aus. Vergleicht dann zu zweit und einigt euch auf die beste Formulierung. Links steht, was viele glauben.</w:t>
       </w:r>
     </w:p>
     <w:tbl>
@@ -580,12 +543,15 @@
                 <w:color w:val="FFFFFF"/>
                 <w:sz w:val="21"/>
               </w:rPr>
-              <w:t>Was die AGB / Realitaet sagen</w:t>
+              <w:t>Was die AGB / Realität sagen</w:t>
             </w:r>
           </w:p>
         </w:tc>
       </w:tr>
       <w:tr>
+        <w:trPr>
+          <w:cantSplit/>
+        </w:trPr>
         <w:tc>
           <w:tcPr>
             <w:tcW w:type="dxa" w:w="3685"/>
@@ -597,7 +563,7 @@
                 <w:i/>
                 <w:sz w:val="20"/>
               </w:rPr>
-              <w:t>Meine Videos gehoeren nur mir.</w:t>
+              <w:t>Meine Videos gehören nur mir.</w:t>
             </w:r>
           </w:p>
         </w:tc>
@@ -614,9 +580,34 @@
               <w:t xml:space="preserve"> </w:t>
             </w:r>
           </w:p>
+          <w:p>
+            <w:pPr>
+              <w:spacing w:after="0" w:line="360" w:lineRule="auto"/>
+            </w:pPr>
+            <w:r>
+              <w:rPr>
+                <w:sz w:val="20"/>
+              </w:rPr>
+              <w:t xml:space="preserve"> </w:t>
+            </w:r>
+          </w:p>
+          <w:p>
+            <w:pPr>
+              <w:spacing w:after="0" w:line="360" w:lineRule="auto"/>
+            </w:pPr>
+            <w:r>
+              <w:rPr>
+                <w:sz w:val="20"/>
+              </w:rPr>
+              <w:t xml:space="preserve"> </w:t>
+            </w:r>
+          </w:p>
         </w:tc>
       </w:tr>
       <w:tr>
+        <w:trPr>
+          <w:cantSplit/>
+        </w:trPr>
         <w:tc>
           <w:tcPr>
             <w:tcW w:type="dxa" w:w="3685"/>
@@ -645,9 +636,34 @@
               <w:t xml:space="preserve"> </w:t>
             </w:r>
           </w:p>
+          <w:p>
+            <w:pPr>
+              <w:spacing w:after="0" w:line="360" w:lineRule="auto"/>
+            </w:pPr>
+            <w:r>
+              <w:rPr>
+                <w:sz w:val="20"/>
+              </w:rPr>
+              <w:t xml:space="preserve"> </w:t>
+            </w:r>
+          </w:p>
+          <w:p>
+            <w:pPr>
+              <w:spacing w:after="0" w:line="360" w:lineRule="auto"/>
+            </w:pPr>
+            <w:r>
+              <w:rPr>
+                <w:sz w:val="20"/>
+              </w:rPr>
+              <w:t xml:space="preserve"> </w:t>
+            </w:r>
+          </w:p>
         </w:tc>
       </w:tr>
       <w:tr>
+        <w:trPr>
+          <w:cantSplit/>
+        </w:trPr>
         <w:tc>
           <w:tcPr>
             <w:tcW w:type="dxa" w:w="3685"/>
@@ -659,7 +675,7 @@
                 <w:i/>
                 <w:sz w:val="20"/>
               </w:rPr>
-              <w:t>TikTok weiss nur, was ich like.</w:t>
+              <w:t>TikTok weiß nur, was ich like.</w:t>
             </w:r>
           </w:p>
         </w:tc>
@@ -676,9 +692,34 @@
               <w:t xml:space="preserve"> </w:t>
             </w:r>
           </w:p>
+          <w:p>
+            <w:pPr>
+              <w:spacing w:after="0" w:line="360" w:lineRule="auto"/>
+            </w:pPr>
+            <w:r>
+              <w:rPr>
+                <w:sz w:val="20"/>
+              </w:rPr>
+              <w:t xml:space="preserve"> </w:t>
+            </w:r>
+          </w:p>
+          <w:p>
+            <w:pPr>
+              <w:spacing w:after="0" w:line="360" w:lineRule="auto"/>
+            </w:pPr>
+            <w:r>
+              <w:rPr>
+                <w:sz w:val="20"/>
+              </w:rPr>
+              <w:t xml:space="preserve"> </w:t>
+            </w:r>
+          </w:p>
         </w:tc>
       </w:tr>
       <w:tr>
+        <w:trPr>
+          <w:cantSplit/>
+        </w:trPr>
         <w:tc>
           <w:tcPr>
             <w:tcW w:type="dxa" w:w="3685"/>
@@ -707,9 +748,34 @@
               <w:t xml:space="preserve"> </w:t>
             </w:r>
           </w:p>
+          <w:p>
+            <w:pPr>
+              <w:spacing w:after="0" w:line="360" w:lineRule="auto"/>
+            </w:pPr>
+            <w:r>
+              <w:rPr>
+                <w:sz w:val="20"/>
+              </w:rPr>
+              <w:t xml:space="preserve"> </w:t>
+            </w:r>
+          </w:p>
+          <w:p>
+            <w:pPr>
+              <w:spacing w:after="0" w:line="360" w:lineRule="auto"/>
+            </w:pPr>
+            <w:r>
+              <w:rPr>
+                <w:sz w:val="20"/>
+              </w:rPr>
+              <w:t xml:space="preserve"> </w:t>
+            </w:r>
+          </w:p>
         </w:tc>
       </w:tr>
       <w:tr>
+        <w:trPr>
+          <w:cantSplit/>
+        </w:trPr>
         <w:tc>
           <w:tcPr>
             <w:tcW w:type="dxa" w:w="3685"/>
@@ -721,7 +787,7 @@
                 <w:i/>
                 <w:sz w:val="20"/>
               </w:rPr>
-              <w:t>LIVE-Geschenke sind nur Spass.</w:t>
+              <w:t>LIVE-Geschenke sind nur Spaß.</w:t>
             </w:r>
           </w:p>
         </w:tc>
@@ -738,9 +804,34 @@
               <w:t xml:space="preserve"> </w:t>
             </w:r>
           </w:p>
+          <w:p>
+            <w:pPr>
+              <w:spacing w:after="0" w:line="360" w:lineRule="auto"/>
+            </w:pPr>
+            <w:r>
+              <w:rPr>
+                <w:sz w:val="20"/>
+              </w:rPr>
+              <w:t xml:space="preserve"> </w:t>
+            </w:r>
+          </w:p>
+          <w:p>
+            <w:pPr>
+              <w:spacing w:after="0" w:line="360" w:lineRule="auto"/>
+            </w:pPr>
+            <w:r>
+              <w:rPr>
+                <w:sz w:val="20"/>
+              </w:rPr>
+              <w:t xml:space="preserve"> </w:t>
+            </w:r>
+          </w:p>
         </w:tc>
       </w:tr>
       <w:tr>
+        <w:trPr>
+          <w:cantSplit/>
+        </w:trPr>
         <w:tc>
           <w:tcPr>
             <w:tcW w:type="dxa" w:w="3685"/>
@@ -752,7 +843,7 @@
                 <w:i/>
                 <w:sz w:val="20"/>
               </w:rPr>
-              <w:t>Account loeschen = alles weg.</w:t>
+              <w:t>Account löschen = alles weg.</w:t>
             </w:r>
           </w:p>
         </w:tc>
@@ -769,18 +860,46 @@
               <w:t xml:space="preserve"> </w:t>
             </w:r>
           </w:p>
+          <w:p>
+            <w:pPr>
+              <w:spacing w:after="0" w:line="360" w:lineRule="auto"/>
+            </w:pPr>
+            <w:r>
+              <w:rPr>
+                <w:sz w:val="20"/>
+              </w:rPr>
+              <w:t xml:space="preserve"> </w:t>
+            </w:r>
+          </w:p>
+          <w:p>
+            <w:pPr>
+              <w:spacing w:after="0" w:line="360" w:lineRule="auto"/>
+            </w:pPr>
+            <w:r>
+              <w:rPr>
+                <w:sz w:val="20"/>
+              </w:rPr>
+              <w:t xml:space="preserve"> </w:t>
+            </w:r>
+          </w:p>
         </w:tc>
       </w:tr>
     </w:tbl>
     <w:p>
+      <w:r>
+        <w:br w:type="page"/>
+      </w:r>
+    </w:p>
+    <w:p>
       <w:pPr>
+        <w:keepNext/>
         <w:spacing w:before="280" w:after="80"/>
       </w:pPr>
       <w:r>
         <w:rPr>
           <w:rFonts w:ascii="Calibri" w:hAnsi="Calibri"/>
           <w:b/>
-          <w:color w:val="B8860B"/>
+          <w:color w:val="7C3AED"/>
           <w:sz w:val="24"/>
         </w:rPr>
         <w:t xml:space="preserve">Aufgabe 4  -  </w:t>
@@ -792,7 +911,7 @@
           <w:color w:val="1A1A1A"/>
           <w:sz w:val="24"/>
         </w:rPr>
-        <w:t>Reflexion - deine Meinung zaehlt</w:t>
+        <w:t>AGB-Decoder: Fachbegriff trifft Klartext</w:t>
       </w:r>
     </w:p>
     <w:p>
@@ -807,11 +926,296 @@
           <w:color w:val="666666"/>
           <w:sz w:val="22"/>
         </w:rPr>
-        <w:t>Beantworte zwei der folgenden vier Fragen ausfuehrlich (je 3-5 Saetze).</w:t>
+        <w:t>In der Lizenz (§ 4.9) stehen vier Wörter, die harmlos klingen, aber viel bedeuten. Ordne jedem Begriff die richtige Erklärung zu - trage den Buchstaben in das Kästchen ein.</w:t>
       </w:r>
     </w:p>
     <w:p>
       <w:pPr>
+        <w:spacing w:after="40" w:before="40"/>
+      </w:pPr>
+      <w:r>
+        <w:rPr>
+          <w:rFonts w:ascii="Calibri" w:hAnsi="Calibri"/>
+          <w:b/>
+          <w:i w:val="0"/>
+          <w:color w:val="1A1A1A"/>
+          <w:sz w:val="22"/>
+        </w:rPr>
+        <w:t>Begriffe:</w:t>
+      </w:r>
+    </w:p>
+    <w:p>
+      <w:pPr>
+        <w:spacing w:after="40"/>
+        <w:ind w:left="283"/>
+      </w:pPr>
+      <w:r>
+        <w:rPr>
+          <w:b/>
+          <w:color w:val="1A1A1A"/>
+          <w:sz w:val="22"/>
+        </w:rPr>
+        <w:t xml:space="preserve">1.  nicht-exklusiv   </w:t>
+      </w:r>
+      <w:r>
+        <w:rPr>
+          <w:b/>
+          <w:color w:val="666666"/>
+          <w:sz w:val="22"/>
+        </w:rPr>
+        <w:t>[          ]</w:t>
+      </w:r>
+    </w:p>
+    <w:p>
+      <w:pPr>
+        <w:spacing w:after="40"/>
+        <w:ind w:left="283"/>
+      </w:pPr>
+      <w:r>
+        <w:rPr>
+          <w:b/>
+          <w:color w:val="1A1A1A"/>
+          <w:sz w:val="22"/>
+        </w:rPr>
+        <w:t xml:space="preserve">2.  gebührenfrei   </w:t>
+      </w:r>
+      <w:r>
+        <w:rPr>
+          <w:b/>
+          <w:color w:val="666666"/>
+          <w:sz w:val="22"/>
+        </w:rPr>
+        <w:t>[          ]</w:t>
+      </w:r>
+    </w:p>
+    <w:p>
+      <w:pPr>
+        <w:spacing w:after="40"/>
+        <w:ind w:left="283"/>
+      </w:pPr>
+      <w:r>
+        <w:rPr>
+          <w:b/>
+          <w:color w:val="1A1A1A"/>
+          <w:sz w:val="22"/>
+        </w:rPr>
+        <w:t xml:space="preserve">3.  übertragbar   </w:t>
+      </w:r>
+      <w:r>
+        <w:rPr>
+          <w:b/>
+          <w:color w:val="666666"/>
+          <w:sz w:val="22"/>
+        </w:rPr>
+        <w:t>[          ]</w:t>
+      </w:r>
+    </w:p>
+    <w:p>
+      <w:pPr>
+        <w:spacing w:after="40"/>
+        <w:ind w:left="283"/>
+      </w:pPr>
+      <w:r>
+        <w:rPr>
+          <w:b/>
+          <w:color w:val="1A1A1A"/>
+          <w:sz w:val="22"/>
+        </w:rPr>
+        <w:t xml:space="preserve">4.  unterlizenzierbar   </w:t>
+      </w:r>
+      <w:r>
+        <w:rPr>
+          <w:b/>
+          <w:color w:val="666666"/>
+          <w:sz w:val="22"/>
+        </w:rPr>
+        <w:t>[          ]</w:t>
+      </w:r>
+    </w:p>
+    <w:p>
+      <w:pPr>
+        <w:spacing w:after="40"/>
+        <w:ind w:left="283"/>
+      </w:pPr>
+      <w:r>
+        <w:rPr>
+          <w:b/>
+          <w:color w:val="1A1A1A"/>
+          <w:sz w:val="22"/>
+        </w:rPr>
+        <w:t xml:space="preserve">5.  weltweit   </w:t>
+      </w:r>
+      <w:r>
+        <w:rPr>
+          <w:b/>
+          <w:color w:val="666666"/>
+          <w:sz w:val="22"/>
+        </w:rPr>
+        <w:t>[          ]</w:t>
+      </w:r>
+    </w:p>
+    <w:p>
+      <w:pPr>
+        <w:spacing w:after="40" w:before="120"/>
+      </w:pPr>
+      <w:r>
+        <w:rPr>
+          <w:rFonts w:ascii="Calibri" w:hAnsi="Calibri"/>
+          <w:b/>
+          <w:i w:val="0"/>
+          <w:color w:val="1A1A1A"/>
+          <w:sz w:val="22"/>
+        </w:rPr>
+        <w:t>Erklärungen (in falscher Reihenfolge):</w:t>
+      </w:r>
+    </w:p>
+    <w:p>
+      <w:pPr>
+        <w:spacing w:after="40"/>
+        <w:ind w:left="283"/>
+      </w:pPr>
+      <w:r>
+        <w:rPr>
+          <w:b/>
+          <w:color w:val="7C3AED"/>
+          <w:sz w:val="21"/>
+        </w:rPr>
+        <w:t xml:space="preserve">A)  </w:t>
+      </w:r>
+      <w:r>
+        <w:rPr>
+          <w:color w:val="1A1A1A"/>
+          <w:sz w:val="21"/>
+        </w:rPr>
+        <w:t>Gilt überall auf der Erde - nicht nur in Deutschland.</w:t>
+      </w:r>
+    </w:p>
+    <w:p>
+      <w:pPr>
+        <w:spacing w:after="40"/>
+        <w:ind w:left="283"/>
+      </w:pPr>
+      <w:r>
+        <w:rPr>
+          <w:b/>
+          <w:color w:val="7C3AED"/>
+          <w:sz w:val="21"/>
+        </w:rPr>
+        <w:t xml:space="preserve">B)  </w:t>
+      </w:r>
+      <w:r>
+        <w:rPr>
+          <w:color w:val="1A1A1A"/>
+          <w:sz w:val="21"/>
+        </w:rPr>
+        <w:t>TikTok zahlt dir dafür keinen Cent.</w:t>
+      </w:r>
+    </w:p>
+    <w:p>
+      <w:pPr>
+        <w:spacing w:after="40"/>
+        <w:ind w:left="283"/>
+      </w:pPr>
+      <w:r>
+        <w:rPr>
+          <w:b/>
+          <w:color w:val="7C3AED"/>
+          <w:sz w:val="21"/>
+        </w:rPr>
+        <w:t xml:space="preserve">C)  </w:t>
+      </w:r>
+      <w:r>
+        <w:rPr>
+          <w:color w:val="1A1A1A"/>
+          <w:sz w:val="21"/>
+        </w:rPr>
+        <w:t>Du gibst dein Recht nicht allein ab - du darfst dein Video auch selbst weiternutzen.</w:t>
+      </w:r>
+    </w:p>
+    <w:p>
+      <w:pPr>
+        <w:spacing w:after="40"/>
+        <w:ind w:left="283"/>
+      </w:pPr>
+      <w:r>
+        <w:rPr>
+          <w:b/>
+          <w:color w:val="7C3AED"/>
+          <w:sz w:val="21"/>
+        </w:rPr>
+        <w:t xml:space="preserve">D)  </w:t>
+      </w:r>
+      <w:r>
+        <w:rPr>
+          <w:color w:val="1A1A1A"/>
+          <w:sz w:val="21"/>
+        </w:rPr>
+        <w:t>TikTok darf das Recht an andere Firmen weitergeben.</w:t>
+      </w:r>
+    </w:p>
+    <w:p>
+      <w:pPr>
+        <w:spacing w:after="40"/>
+        <w:ind w:left="283"/>
+      </w:pPr>
+      <w:r>
+        <w:rPr>
+          <w:b/>
+          <w:color w:val="7C3AED"/>
+          <w:sz w:val="21"/>
+        </w:rPr>
+        <w:t xml:space="preserve">E)  </w:t>
+      </w:r>
+      <w:r>
+        <w:rPr>
+          <w:color w:val="1A1A1A"/>
+          <w:sz w:val="21"/>
+        </w:rPr>
+        <w:t>TikTok darf anderen erlauben, deine Inhalte ebenfalls zu nutzen.</w:t>
+      </w:r>
+    </w:p>
+    <w:p>
+      <w:pPr>
+        <w:keepNext/>
+        <w:spacing w:before="280" w:after="80"/>
+      </w:pPr>
+      <w:r>
+        <w:rPr>
+          <w:rFonts w:ascii="Calibri" w:hAnsi="Calibri"/>
+          <w:b/>
+          <w:color w:val="B8860B"/>
+          <w:sz w:val="24"/>
+        </w:rPr>
+        <w:t xml:space="preserve">Aufgabe 5  -  </w:t>
+      </w:r>
+      <w:r>
+        <w:rPr>
+          <w:rFonts w:ascii="Calibri" w:hAnsi="Calibri"/>
+          <w:b/>
+          <w:color w:val="1A1A1A"/>
+          <w:sz w:val="24"/>
+        </w:rPr>
+        <w:t>Reflexion - deine Meinung zählt</w:t>
+      </w:r>
+    </w:p>
+    <w:p>
+      <w:pPr>
+        <w:spacing w:after="160" w:before="0"/>
+      </w:pPr>
+      <w:r>
+        <w:rPr>
+          <w:rFonts w:ascii="Calibri" w:hAnsi="Calibri"/>
+          <w:b w:val="0"/>
+          <w:i/>
+          <w:color w:val="666666"/>
+          <w:sz w:val="22"/>
+        </w:rPr>
+        <w:t>Beantworte zwei der folgenden vier Fragen ausführlich (je 3-5 Sätze).</w:t>
+      </w:r>
+    </w:p>
+    <w:p>
+      <w:pPr>
+        <w:keepNext/>
         <w:spacing w:after="80" w:before="0"/>
       </w:pPr>
       <w:r>
@@ -822,12 +1226,13 @@
           <w:color w:val="1A1A1A"/>
           <w:sz w:val="22"/>
         </w:rPr>
-        <w:t>1. Wuerdest du diese AGB unterschreiben, wenn man sie dir auf Papier vorlegt? Begruende.</w:t>
+        <w:t>1. Würdest du diese AGB unterschreiben, wenn man sie dir auf Papier vorlegt? Begründe.</w:t>
       </w:r>
     </w:p>
     <w:p>
       <w:pPr>
-        <w:spacing w:after="0" w:before="0"/>
+        <w:keepNext/>
+        <w:spacing w:after="0" w:before="0" w:line="480" w:lineRule="auto"/>
       </w:pPr>
       <w:r>
         <w:rPr>
@@ -839,7 +1244,8 @@
     </w:p>
     <w:p>
       <w:pPr>
-        <w:spacing w:after="0" w:before="0"/>
+        <w:keepNext/>
+        <w:spacing w:after="0" w:before="0" w:line="480" w:lineRule="auto"/>
       </w:pPr>
       <w:r>
         <w:rPr>
@@ -851,19 +1257,7 @@
     </w:p>
     <w:p>
       <w:pPr>
-        <w:spacing w:after="0" w:before="0"/>
-      </w:pPr>
-      <w:r>
-        <w:rPr>
-          <w:color w:val="CCCCCC"/>
-          <w:sz w:val="22"/>
-        </w:rPr>
-        <w:t>__________________________________________________________________________________________</w:t>
-      </w:r>
-    </w:p>
-    <w:p>
-      <w:pPr>
-        <w:spacing w:after="0" w:before="0"/>
+        <w:spacing w:after="0" w:before="0" w:line="480" w:lineRule="auto"/>
       </w:pPr>
       <w:r>
         <w:rPr>
@@ -880,6 +1274,7 @@
     </w:p>
     <w:p>
       <w:pPr>
+        <w:keepNext/>
         <w:spacing w:after="80" w:before="0"/>
       </w:pPr>
       <w:r>
@@ -895,7 +1290,8 @@
     </w:p>
     <w:p>
       <w:pPr>
-        <w:spacing w:after="0" w:before="0"/>
+        <w:keepNext/>
+        <w:spacing w:after="0" w:before="0" w:line="480" w:lineRule="auto"/>
       </w:pPr>
       <w:r>
         <w:rPr>
@@ -907,7 +1303,8 @@
     </w:p>
     <w:p>
       <w:pPr>
-        <w:spacing w:after="0" w:before="0"/>
+        <w:keepNext/>
+        <w:spacing w:after="0" w:before="0" w:line="480" w:lineRule="auto"/>
       </w:pPr>
       <w:r>
         <w:rPr>
@@ -919,19 +1316,7 @@
     </w:p>
     <w:p>
       <w:pPr>
-        <w:spacing w:after="0" w:before="0"/>
-      </w:pPr>
-      <w:r>
-        <w:rPr>
-          <w:color w:val="CCCCCC"/>
-          <w:sz w:val="22"/>
-        </w:rPr>
-        <w:t>__________________________________________________________________________________________</w:t>
-      </w:r>
-    </w:p>
-    <w:p>
-      <w:pPr>
-        <w:spacing w:after="0" w:before="0"/>
+        <w:spacing w:after="0" w:before="0" w:line="480" w:lineRule="auto"/>
       </w:pPr>
       <w:r>
         <w:rPr>
@@ -948,6 +1333,7 @@
     </w:p>
     <w:p>
       <w:pPr>
+        <w:keepNext/>
         <w:spacing w:after="80" w:before="0"/>
       </w:pPr>
       <w:r>
@@ -958,12 +1344,13 @@
           <w:color w:val="1A1A1A"/>
           <w:sz w:val="22"/>
         </w:rPr>
-        <w:t>3. Sollte der personalisierte 'Fuer dich'-Feed fuer Jugendliche standardmaessig aus sein? Pro/Kontra.</w:t>
+        <w:t>3. Sollte der personalisierte 'Für dich'-Feed für Jugendliche standardmäßig aus sein? Pro/Kontra.</w:t>
       </w:r>
     </w:p>
     <w:p>
       <w:pPr>
-        <w:spacing w:after="0" w:before="0"/>
+        <w:keepNext/>
+        <w:spacing w:after="0" w:before="0" w:line="480" w:lineRule="auto"/>
       </w:pPr>
       <w:r>
         <w:rPr>
@@ -975,7 +1362,8 @@
     </w:p>
     <w:p>
       <w:pPr>
-        <w:spacing w:after="0" w:before="0"/>
+        <w:keepNext/>
+        <w:spacing w:after="0" w:before="0" w:line="480" w:lineRule="auto"/>
       </w:pPr>
       <w:r>
         <w:rPr>
@@ -987,19 +1375,7 @@
     </w:p>
     <w:p>
       <w:pPr>
-        <w:spacing w:after="0" w:before="0"/>
-      </w:pPr>
-      <w:r>
-        <w:rPr>
-          <w:color w:val="CCCCCC"/>
-          <w:sz w:val="22"/>
-        </w:rPr>
-        <w:t>__________________________________________________________________________________________</w:t>
-      </w:r>
-    </w:p>
-    <w:p>
-      <w:pPr>
-        <w:spacing w:after="0" w:before="0"/>
+        <w:spacing w:after="0" w:before="0" w:line="480" w:lineRule="auto"/>
       </w:pPr>
       <w:r>
         <w:rPr>
@@ -1016,6 +1392,7 @@
     </w:p>
     <w:p>
       <w:pPr>
+        <w:keepNext/>
         <w:spacing w:after="80" w:before="0"/>
       </w:pPr>
       <w:r>
@@ -1026,12 +1403,13 @@
           <w:color w:val="1A1A1A"/>
           <w:sz w:val="22"/>
         </w:rPr>
-        <w:t>4. Was bedeutet es fuer dich, dass TikTok deine Videos 'gebuehrenfrei und weltweit' nutzen darf?</w:t>
+        <w:t>4. Was bedeutet es für dich, dass TikTok deine Videos 'gebührenfrei und weltweit' nutzen darf?</w:t>
       </w:r>
     </w:p>
     <w:p>
       <w:pPr>
-        <w:spacing w:after="0" w:before="0"/>
+        <w:keepNext/>
+        <w:spacing w:after="0" w:before="0" w:line="480" w:lineRule="auto"/>
       </w:pPr>
       <w:r>
         <w:rPr>
@@ -1043,7 +1421,8 @@
     </w:p>
     <w:p>
       <w:pPr>
-        <w:spacing w:after="0" w:before="0"/>
+        <w:keepNext/>
+        <w:spacing w:after="0" w:before="0" w:line="480" w:lineRule="auto"/>
       </w:pPr>
       <w:r>
         <w:rPr>
@@ -1055,19 +1434,7 @@
     </w:p>
     <w:p>
       <w:pPr>
-        <w:spacing w:after="0" w:before="0"/>
-      </w:pPr>
-      <w:r>
-        <w:rPr>
-          <w:color w:val="CCCCCC"/>
-          <w:sz w:val="22"/>
-        </w:rPr>
-        <w:t>__________________________________________________________________________________________</w:t>
-      </w:r>
-    </w:p>
-    <w:p>
-      <w:pPr>
-        <w:spacing w:after="0" w:before="0"/>
+        <w:spacing w:after="0" w:before="0" w:line="480" w:lineRule="auto"/>
       </w:pPr>
       <w:r>
         <w:rPr>
@@ -1081,6 +1448,258 @@
       <w:pPr>
         <w:spacing w:after="40"/>
       </w:pPr>
+    </w:p>
+    <w:p>
+      <w:pPr>
+        <w:keepNext/>
+        <w:spacing w:before="280" w:after="80"/>
+      </w:pPr>
+      <w:r>
+        <w:rPr>
+          <w:b/>
+          <w:color w:val="E11D48"/>
+          <w:sz w:val="24"/>
+        </w:rPr>
+        <w:t xml:space="preserve">Profi-Aufgabe (für Schnelle)  -  </w:t>
+      </w:r>
+      <w:r>
+        <w:rPr>
+          <w:b/>
+          <w:color w:val="1A1A1A"/>
+          <w:sz w:val="24"/>
+        </w:rPr>
+        <w:t>Rechnen mit dem 50-%-Trick</w:t>
+      </w:r>
+    </w:p>
+    <w:p>
+      <w:pPr>
+        <w:spacing w:after="120" w:before="0"/>
+      </w:pPr>
+      <w:r>
+        <w:rPr>
+          <w:rFonts w:ascii="Calibri" w:hAnsi="Calibri"/>
+          <w:b w:val="0"/>
+          <w:i/>
+          <w:color w:val="666666"/>
+          <w:sz w:val="22"/>
+        </w:rPr>
+        <w:t>Bei LIVE-Geschenken behält TikTok rund die Hälfte. Rechne und denke nach:</w:t>
+      </w:r>
+    </w:p>
+    <w:p>
+      <w:pPr>
+        <w:keepNext/>
+        <w:spacing w:after="40" w:before="80"/>
+      </w:pPr>
+      <w:r>
+        <w:rPr>
+          <w:rFonts w:ascii="Calibri" w:hAnsi="Calibri"/>
+          <w:b/>
+          <w:i w:val="0"/>
+          <w:color w:val="1A1A1A"/>
+          <w:sz w:val="22"/>
+        </w:rPr>
+        <w:t>a) Ein Creator bekommt Geschenke im Wert von 80 €. Wie viel bleibt ihm, wie viel behält TikTok?</w:t>
+      </w:r>
+    </w:p>
+    <w:p>
+      <w:pPr>
+        <w:keepNext/>
+        <w:spacing w:after="0" w:before="0" w:line="480" w:lineRule="auto"/>
+      </w:pPr>
+      <w:r>
+        <w:rPr>
+          <w:color w:val="CCCCCC"/>
+          <w:sz w:val="22"/>
+        </w:rPr>
+        <w:t>__________________________________________________________________________________________</w:t>
+      </w:r>
+    </w:p>
+    <w:p>
+      <w:pPr>
+        <w:spacing w:after="0" w:before="0" w:line="480" w:lineRule="auto"/>
+      </w:pPr>
+      <w:r>
+        <w:rPr>
+          <w:color w:val="CCCCCC"/>
+          <w:sz w:val="22"/>
+        </w:rPr>
+        <w:t>__________________________________________________________________________________________</w:t>
+      </w:r>
+    </w:p>
+    <w:p>
+      <w:pPr>
+        <w:keepNext/>
+        <w:spacing w:after="40" w:before="80"/>
+      </w:pPr>
+      <w:r>
+        <w:rPr>
+          <w:rFonts w:ascii="Calibri" w:hAnsi="Calibri"/>
+          <w:b/>
+          <w:i w:val="0"/>
+          <w:color w:val="1A1A1A"/>
+          <w:sz w:val="22"/>
+        </w:rPr>
+        <w:t>b) Wie viel müssen Fans insgesamt verschenken, damit beim Creator 100 € ankommen?</w:t>
+      </w:r>
+    </w:p>
+    <w:p>
+      <w:pPr>
+        <w:keepNext/>
+        <w:spacing w:after="0" w:before="0" w:line="480" w:lineRule="auto"/>
+      </w:pPr>
+      <w:r>
+        <w:rPr>
+          <w:color w:val="CCCCCC"/>
+          <w:sz w:val="22"/>
+        </w:rPr>
+        <w:t>__________________________________________________________________________________________</w:t>
+      </w:r>
+    </w:p>
+    <w:p>
+      <w:pPr>
+        <w:spacing w:after="0" w:before="0" w:line="480" w:lineRule="auto"/>
+      </w:pPr>
+      <w:r>
+        <w:rPr>
+          <w:color w:val="CCCCCC"/>
+          <w:sz w:val="22"/>
+        </w:rPr>
+        <w:t>__________________________________________________________________________________________</w:t>
+      </w:r>
+    </w:p>
+    <w:p>
+      <w:pPr>
+        <w:keepNext/>
+        <w:spacing w:after="40" w:before="80"/>
+      </w:pPr>
+      <w:r>
+        <w:rPr>
+          <w:rFonts w:ascii="Calibri" w:hAnsi="Calibri"/>
+          <w:b/>
+          <w:i w:val="0"/>
+          <w:color w:val="1A1A1A"/>
+          <w:sz w:val="22"/>
+        </w:rPr>
+        <w:t>c) Knifflig: Erkläre, warum TikTok an einem einzigen Geschenk sogar DOPPELT verdient. (Tipp: Wie kommen die Fans überhaupt an ihre Coins?)</w:t>
+      </w:r>
+    </w:p>
+    <w:p>
+      <w:pPr>
+        <w:keepNext/>
+        <w:spacing w:after="0" w:before="0" w:line="480" w:lineRule="auto"/>
+      </w:pPr>
+      <w:r>
+        <w:rPr>
+          <w:color w:val="CCCCCC"/>
+          <w:sz w:val="22"/>
+        </w:rPr>
+        <w:t>__________________________________________________________________________________________</w:t>
+      </w:r>
+    </w:p>
+    <w:p>
+      <w:pPr>
+        <w:spacing w:after="0" w:before="0" w:line="480" w:lineRule="auto"/>
+      </w:pPr>
+      <w:r>
+        <w:rPr>
+          <w:color w:val="CCCCCC"/>
+          <w:sz w:val="22"/>
+        </w:rPr>
+        <w:t>__________________________________________________________________________________________</w:t>
+      </w:r>
+    </w:p>
+    <w:p>
+      <w:pPr>
+        <w:spacing w:after="80" w:before="280"/>
+      </w:pPr>
+      <w:r>
+        <w:rPr>
+          <w:rFonts w:ascii="Calibri" w:hAnsi="Calibri"/>
+          <w:b/>
+          <w:i w:val="0"/>
+          <w:color w:val="0C8C88"/>
+          <w:sz w:val="24"/>
+        </w:rPr>
+        <w:t>Selbstcheck - Wie sicher bin ich?</w:t>
+      </w:r>
+    </w:p>
+    <w:p>
+      <w:pPr>
+        <w:spacing w:after="60"/>
+      </w:pPr>
+      <w:r>
+        <w:rPr>
+          <w:color w:val="1A1A1A"/>
+          <w:sz w:val="21"/>
+        </w:rPr>
+        <w:t xml:space="preserve">Ich kann in einem Satz erklären, was TikTok mit meinen Videos machen darf.   </w:t>
+      </w:r>
+      <w:r>
+        <w:rPr>
+          <w:color w:val="666666"/>
+          <w:sz w:val="21"/>
+        </w:rPr>
+        <w:t>[ ] sicher   [ ] teils   [ ] noch unsicher</w:t>
+      </w:r>
+    </w:p>
+    <w:p>
+      <w:pPr>
+        <w:spacing w:after="60"/>
+      </w:pPr>
+      <w:r>
+        <w:rPr>
+          <w:color w:val="1A1A1A"/>
+          <w:sz w:val="21"/>
+        </w:rPr>
+        <w:t xml:space="preserve">Ich kenne mindestens 2 Daten, die TikTok automatisch über mich sammelt.   </w:t>
+      </w:r>
+      <w:r>
+        <w:rPr>
+          <w:color w:val="666666"/>
+          <w:sz w:val="21"/>
+        </w:rPr>
+        <w:t>[ ] sicher   [ ] teils   [ ] noch unsicher</w:t>
+      </w:r>
+    </w:p>
+    <w:p>
+      <w:pPr>
+        <w:spacing w:after="60"/>
+      </w:pPr>
+      <w:r>
+        <w:rPr>
+          <w:color w:val="1A1A1A"/>
+          <w:sz w:val="21"/>
+        </w:rPr>
+        <w:t xml:space="preserve">Ich kann den 50-%-Trick bei LIVE-Geschenken erklären.   </w:t>
+      </w:r>
+      <w:r>
+        <w:rPr>
+          <w:color w:val="666666"/>
+          <w:sz w:val="21"/>
+        </w:rPr>
+        <w:t>[ ] sicher   [ ] teils   [ ] noch unsicher</w:t>
+      </w:r>
+    </w:p>
+    <w:p>
+      <w:pPr>
+        <w:spacing w:after="40"/>
+      </w:pPr>
+      <w:r>
+        <w:rPr>
+          <w:b/>
+          <w:color w:val="1A1A1A"/>
+          <w:sz w:val="21"/>
+        </w:rPr>
+        <w:t xml:space="preserve">Das nehme ich mir ab heute konkret vor:  </w:t>
+      </w:r>
+      <w:r>
+        <w:rPr>
+          <w:color w:val="CCCCCC"/>
+          <w:sz w:val="21"/>
+        </w:rPr>
+        <w:t>_______________________________________________</w:t>
+      </w:r>
     </w:p>
     <w:p>
       <w:pPr>
@@ -1101,13 +1720,57 @@
       </w:r>
     </w:p>
     <w:sectPr>
+      <w:footerReference w:type="default" r:id="rId9"/>
       <w:pgSz w:w="12240" w:h="15840"/>
-      <w:pgMar w:top="850" w:right="1020" w:bottom="850" w:left="1020" w:header="720" w:footer="720" w:gutter="0"/>
+      <w:pgMar w:top="680" w:right="1020" w:bottom="680" w:left="1020" w:header="720" w:footer="720" w:gutter="0"/>
       <w:cols w:space="720"/>
       <w:docGrid w:linePitch="360"/>
     </w:sectPr>
   </w:body>
 </w:document>
+</file>
+
+<file path=word/footer1.xml><?xml version="1.0" encoding="utf-8"?>
+<w:ftr xmlns:m="http://schemas.openxmlformats.org/officeDocument/2006/math" xmlns:mc="http://schemas.openxmlformats.org/markup-compatibility/2006" xmlns:mo="http://schemas.microsoft.com/office/mac/office/2008/main" xmlns:mv="urn:schemas-microsoft-com:mac:vml" xmlns:o="urn:schemas-microsoft-com:office:office" xmlns:r="http://schemas.openxmlformats.org/officeDocument/2006/relationships" xmlns:v="urn:schemas-microsoft-com:vml" xmlns:w10="urn:schemas-microsoft-com:office:word" xmlns:w14="http://schemas.microsoft.com/office/word/2010/wordml" xmlns:w="http://schemas.openxmlformats.org/wordprocessingml/2006/main" xmlns:wne="http://schemas.microsoft.com/office/word/2006/wordml" xmlns:wp14="http://schemas.microsoft.com/office/word/2010/wordprocessingDrawing" xmlns:wp="http://schemas.openxmlformats.org/drawingml/2006/wordprocessingDrawing" xmlns:wpc="http://schemas.microsoft.com/office/word/2010/wordprocessingCanvas" xmlns:wpg="http://schemas.microsoft.com/office/word/2010/wordprocessingGroup" xmlns:wpi="http://schemas.microsoft.com/office/word/2010/wordprocessingInk" xmlns:wps="http://schemas.microsoft.com/office/word/2010/wordprocessingShape" mc:Ignorable="w14 wp14">
+  <w:p>
+    <w:pPr>
+      <w:pStyle w:val="Footer"/>
+      <w:jc w:val="center"/>
+    </w:pPr>
+    <w:r>
+      <w:rPr>
+        <w:color w:val="666666"/>
+        <w:sz w:val="16"/>
+      </w:rPr>
+      <w:t xml:space="preserve">Seite </w:t>
+    </w:r>
+    <w:r>
+      <w:rPr>
+        <w:color w:val="666666"/>
+        <w:sz w:val="16"/>
+      </w:rPr>
+      <w:fldChar w:fldCharType="begin"/>
+      <w:instrText xml:space="preserve">PAGE</w:instrText>
+      <w:fldChar w:fldCharType="end"/>
+    </w:r>
+    <w:r>
+      <w:rPr>
+        <w:color w:val="666666"/>
+        <w:sz w:val="16"/>
+      </w:rPr>
+      <w:t xml:space="preserve"> von </w:t>
+    </w:r>
+    <w:r>
+      <w:rPr>
+        <w:color w:val="666666"/>
+        <w:sz w:val="16"/>
+      </w:rPr>
+      <w:fldChar w:fldCharType="begin"/>
+      <w:instrText xml:space="preserve">NUMPAGES</w:instrText>
+      <w:fldChar w:fldCharType="end"/>
+    </w:r>
+  </w:p>
+</w:ftr>
 </file>
 
 <file path=word/numbering.xml><?xml version="1.0" encoding="utf-8"?>

</xml_diff>